<commit_message>
test: Add ocr test. Add api root test
</commit_message>
<xml_diff>
--- a/tests/testdata/foo.docx
+++ b/tests/testdata/foo.docx
@@ -11,7 +11,7 @@
       </w:pPr>
       <w:r>
         <w:rPr/>
-        <w:t>foobar</w:t>
+        <w:t>Foobar</w:t>
       </w:r>
     </w:p>
     <w:p>
@@ -43,7 +43,7 @@
             <wp:positionV relativeFrom="paragraph">
               <wp:posOffset>635</wp:posOffset>
             </wp:positionV>
-            <wp:extent cx="6120130" cy="6120130"/>
+            <wp:extent cx="6120130" cy="3338195"/>
             <wp:effectExtent l="0" t="0" r="0" b="0"/>
             <wp:wrapSquare wrapText="largest"/>
             <wp:docPr id="1" name="Bild1"/>
@@ -68,7 +68,7 @@
                   <pic:spPr bwMode="auto">
                     <a:xfrm>
                       <a:off x="0" y="0"/>
-                      <a:ext cx="6120130" cy="6120130"/>
+                      <a:ext cx="6120130" cy="3338195"/>
                     </a:xfrm>
                     <a:prstGeom prst="rect">
                       <a:avLst/>
@@ -89,6 +89,7 @@
       <w:pgNumType w:fmt="decimal"/>
       <w:formProt w:val="false"/>
       <w:textDirection w:val="lrTb"/>
+      <w:docGrid w:type="default" w:linePitch="100" w:charSpace="0"/>
     </w:sectPr>
   </w:body>
 </w:document>
@@ -108,7 +109,6 @@
     </w:rPrDefault>
     <w:pPrDefault>
       <w:pPr>
-        <w:widowControl/>
         <w:suppressAutoHyphens w:val="true"/>
       </w:pPr>
     </w:pPrDefault>
@@ -118,7 +118,10 @@
     <w:qFormat/>
     <w:pPr>
       <w:widowControl/>
+      <w:suppressAutoHyphens w:val="true"/>
       <w:bidi w:val="0"/>
+      <w:spacing w:before="0" w:after="0"/>
+      <w:jc w:val="start"/>
     </w:pPr>
     <w:rPr>
       <w:rFonts w:ascii="Liberation Serif" w:hAnsi="Liberation Serif" w:eastAsia="Noto Serif CJK SC" w:cs="Noto Sans Devanagari"/>
@@ -178,6 +181,32 @@
   </w:style>
   <w:style w:type="paragraph" w:styleId="Verzeichnis">
     <w:name w:val="Verzeichnis"/>
+    <w:basedOn w:val="Normal"/>
+    <w:qFormat/>
+    <w:pPr>
+      <w:suppressLineNumbers/>
+    </w:pPr>
+    <w:rPr>
+      <w:rFonts w:cs="Noto Sans Devanagari"/>
+    </w:rPr>
+  </w:style>
+  <w:style w:type="paragraph" w:styleId="berschriftuser">
+    <w:name w:val="Überschrift (user)"/>
+    <w:basedOn w:val="Normal"/>
+    <w:next w:val="BodyText"/>
+    <w:qFormat/>
+    <w:pPr>
+      <w:keepNext w:val="true"/>
+      <w:spacing w:before="240" w:after="120"/>
+    </w:pPr>
+    <w:rPr>
+      <w:rFonts w:ascii="Liberation Sans" w:hAnsi="Liberation Sans" w:eastAsia="Noto Sans CJK SC" w:cs="Noto Sans Devanagari"/>
+      <w:sz w:val="28"/>
+      <w:szCs w:val="28"/>
+    </w:rPr>
+  </w:style>
+  <w:style w:type="paragraph" w:styleId="Verzeichnisuser">
+    <w:name w:val="Verzeichnis (user)"/>
     <w:basedOn w:val="Normal"/>
     <w:qFormat/>
     <w:pPr>

</xml_diff>